<commit_message>
Replace Topic 01 Parts 2 and 3 Word documents with updated versions.
</commit_message>
<xml_diff>
--- a/content/chem/felix/topic-01-parts-2-3/Topic-01-Part-2.docx
+++ b/content/chem/felix/topic-01-parts-2-3/Topic-01-Part-2.docx
@@ -395,6 +395,7 @@
         <w:rPr>
           <w:rFonts w:ascii="Times New Roman" w:hAnsi="Times New Roman"/>
           <w:i/>
+          <w:noProof/>
           <w:sz w:val="18"/>
           <w:szCs w:val="18"/>
         </w:rPr>
@@ -633,6 +634,7 @@
         <w:rPr>
           <w:rFonts w:ascii="Times New Roman" w:hAnsi="Times New Roman"/>
           <w:i/>
+          <w:noProof/>
           <w:sz w:val="18"/>
           <w:szCs w:val="18"/>
         </w:rPr>
@@ -679,13 +681,6 @@
           <w:szCs w:val="22"/>
         </w:rPr>
         <w:br/>
-      </w:r>
-      <w:r>
-        <w:rPr>
-          <w:rFonts w:ascii="Times New Roman" w:hAnsi="Times New Roman"/>
-          <w:sz w:val="22"/>
-          <w:szCs w:val="22"/>
-        </w:rPr>
         <w:t>Name the apparatus labelled as A, B, C, D and E.</w:t>
       </w:r>
     </w:p>
@@ -781,11 +776,12 @@
         <w:rPr>
           <w:rFonts w:ascii="Times New Roman" w:hAnsi="Times New Roman"/>
           <w:i/>
+          <w:noProof/>
           <w:sz w:val="18"/>
           <w:szCs w:val="18"/>
         </w:rPr>
         <w:drawing>
-          <wp:inline distT="0" distB="0" distL="0" distR="0" wp14:anchorId="63781E5E" wp14:editId="0E3632A5">
+          <wp:inline distT="0" distB="0" distL="0" distR="0" wp14:anchorId="63781E5E" wp14:editId="156F17CF">
             <wp:extent cx="3909655" cy="2914650"/>
             <wp:effectExtent l="0" t="0" r="0" b="0"/>
             <wp:docPr id="1377139755" name="Picture 2"/>
@@ -1448,6 +1444,7 @@
         <w:rPr>
           <w:rFonts w:ascii="Times New Roman" w:hAnsi="Times New Roman"/>
           <w:i/>
+          <w:noProof/>
           <w:sz w:val="18"/>
           <w:szCs w:val="18"/>
         </w:rPr>
@@ -1844,13 +1841,14 @@
         <w:rPr>
           <w:rFonts w:ascii="Times New Roman" w:hAnsi="Times New Roman"/>
           <w:i/>
+          <w:noProof/>
           <w:sz w:val="18"/>
           <w:szCs w:val="18"/>
         </w:rPr>
         <w:drawing>
-          <wp:inline distT="0" distB="0" distL="0" distR="0" wp14:anchorId="527B7952" wp14:editId="0B40D7B0">
-            <wp:extent cx="3651337" cy="2069706"/>
-            <wp:effectExtent l="0" t="0" r="0" b="0"/>
+          <wp:inline distT="0" distB="0" distL="0" distR="0" wp14:anchorId="527B7952" wp14:editId="2A2929A5">
+            <wp:extent cx="3650912" cy="381000"/>
+            <wp:effectExtent l="0" t="0" r="6985" b="0"/>
             <wp:docPr id="711468770" name="Picture 20"/>
             <wp:cNvGraphicFramePr>
               <a:graphicFrameLocks xmlns:a="http://schemas.openxmlformats.org/drawingml/2006/main" noChangeAspect="1"/>
@@ -1864,8 +1862,77 @@
                       <a:picLocks noChangeAspect="1" noChangeArrowheads="1"/>
                     </pic:cNvPicPr>
                   </pic:nvPicPr>
+                  <pic:blipFill rotWithShape="1">
+                    <a:blip r:embed="rId8">
+                      <a:extLst>
+                        <a:ext uri="{28A0092B-C50C-407E-A947-70E740481C1C}">
+                          <a14:useLocalDpi xmlns:a14="http://schemas.microsoft.com/office/drawing/2010/main" val="0"/>
+                        </a:ext>
+                      </a:extLst>
+                    </a:blip>
+                    <a:srcRect b="81589"/>
+                    <a:stretch>
+                      <a:fillRect/>
+                    </a:stretch>
+                  </pic:blipFill>
+                  <pic:spPr bwMode="auto">
+                    <a:xfrm>
+                      <a:off x="0" y="0"/>
+                      <a:ext cx="3663134" cy="382275"/>
+                    </a:xfrm>
+                    <a:prstGeom prst="rect">
+                      <a:avLst/>
+                    </a:prstGeom>
+                    <a:noFill/>
+                    <a:ln>
+                      <a:noFill/>
+                    </a:ln>
+                    <a:extLst>
+                      <a:ext uri="{53640926-AAD7-44D8-BBD7-CCE9431645EC}">
+                        <a14:shadowObscured xmlns:a14="http://schemas.microsoft.com/office/drawing/2010/main"/>
+                      </a:ext>
+                    </a:extLst>
+                  </pic:spPr>
+                </pic:pic>
+              </a:graphicData>
+            </a:graphic>
+          </wp:inline>
+        </w:drawing>
+      </w:r>
+    </w:p>
+    <w:p>
+      <w:pPr>
+        <w:spacing w:after="80"/>
+        <w:rPr>
+          <w:rFonts w:ascii="Times New Roman" w:hAnsi="Times New Roman"/>
+          <w:i/>
+          <w:sz w:val="18"/>
+          <w:szCs w:val="18"/>
+        </w:rPr>
+      </w:pPr>
+      <w:r>
+        <w:rPr>
+          <w:noProof/>
+        </w:rPr>
+        <w:drawing>
+          <wp:inline distT="0" distB="0" distL="0" distR="0" wp14:anchorId="13DCAE70" wp14:editId="0AC550FD">
+            <wp:extent cx="1714500" cy="1714500"/>
+            <wp:effectExtent l="0" t="0" r="0" b="0"/>
+            <wp:docPr id="1262554197" name="Picture 2" descr="GHS 03 Label / Oxidizing CLP Pictogram. buy Online at Hibiscus"/>
+            <wp:cNvGraphicFramePr>
+              <a:graphicFrameLocks xmlns:a="http://schemas.openxmlformats.org/drawingml/2006/main" noChangeAspect="1"/>
+            </wp:cNvGraphicFramePr>
+            <a:graphic xmlns:a="http://schemas.openxmlformats.org/drawingml/2006/main">
+              <a:graphicData uri="http://schemas.openxmlformats.org/drawingml/2006/picture">
+                <pic:pic xmlns:pic="http://schemas.openxmlformats.org/drawingml/2006/picture">
+                  <pic:nvPicPr>
+                    <pic:cNvPr id="0" name="Picture 6" descr="GHS 03 Label / Oxidizing CLP Pictogram. buy Online at Hibiscus"/>
+                    <pic:cNvPicPr>
+                      <a:picLocks noChangeAspect="1" noChangeArrowheads="1"/>
+                    </pic:cNvPicPr>
+                  </pic:nvPicPr>
                   <pic:blipFill>
-                    <a:blip r:embed="rId8">
+                    <a:blip r:embed="rId9" cstate="print">
                       <a:extLst>
                         <a:ext uri="{28A0092B-C50C-407E-A947-70E740481C1C}">
                           <a14:useLocalDpi xmlns:a14="http://schemas.microsoft.com/office/drawing/2010/main" val="0"/>
@@ -1880,7 +1947,7 @@
                   <pic:spPr bwMode="auto">
                     <a:xfrm>
                       <a:off x="0" y="0"/>
-                      <a:ext cx="3663134" cy="2076393"/>
+                      <a:ext cx="1714500" cy="1714500"/>
                     </a:xfrm>
                     <a:prstGeom prst="rect">
                       <a:avLst/>
@@ -1896,6 +1963,64 @@
           </wp:inline>
         </w:drawing>
       </w:r>
+      <w:r>
+        <w:rPr>
+          <w:noProof/>
+        </w:rPr>
+        <w:drawing>
+          <wp:inline distT="0" distB="0" distL="0" distR="0" wp14:anchorId="49BADAC3" wp14:editId="63D24A09">
+            <wp:extent cx="2165350" cy="1717347"/>
+            <wp:effectExtent l="0" t="0" r="6350" b="0"/>
+            <wp:docPr id="679090502" name="Picture 3" descr="Know Your Hazard Symbols (Pictograms) | Office of Environmental Health and  Safety"/>
+            <wp:cNvGraphicFramePr>
+              <a:graphicFrameLocks xmlns:a="http://schemas.openxmlformats.org/drawingml/2006/main" noChangeAspect="1"/>
+            </wp:cNvGraphicFramePr>
+            <a:graphic xmlns:a="http://schemas.openxmlformats.org/drawingml/2006/main">
+              <a:graphicData uri="http://schemas.openxmlformats.org/drawingml/2006/picture">
+                <pic:pic xmlns:pic="http://schemas.openxmlformats.org/drawingml/2006/picture">
+                  <pic:nvPicPr>
+                    <pic:cNvPr id="0" name="Picture 8" descr="Know Your Hazard Symbols (Pictograms) | Office of Environmental Health and  Safety"/>
+                    <pic:cNvPicPr>
+                      <a:picLocks noChangeAspect="1" noChangeArrowheads="1"/>
+                    </pic:cNvPicPr>
+                  </pic:nvPicPr>
+                  <pic:blipFill rotWithShape="1">
+                    <a:blip r:embed="rId10" cstate="print">
+                      <a:extLst>
+                        <a:ext uri="{28A0092B-C50C-407E-A947-70E740481C1C}">
+                          <a14:useLocalDpi xmlns:a14="http://schemas.microsoft.com/office/drawing/2010/main" val="0"/>
+                        </a:ext>
+                      </a:extLst>
+                    </a:blip>
+                    <a:srcRect t="11035" b="9655"/>
+                    <a:stretch>
+                      <a:fillRect/>
+                    </a:stretch>
+                  </pic:blipFill>
+                  <pic:spPr bwMode="auto">
+                    <a:xfrm>
+                      <a:off x="0" y="0"/>
+                      <a:ext cx="2172630" cy="1723121"/>
+                    </a:xfrm>
+                    <a:prstGeom prst="rect">
+                      <a:avLst/>
+                    </a:prstGeom>
+                    <a:noFill/>
+                    <a:ln>
+                      <a:noFill/>
+                    </a:ln>
+                    <a:extLst>
+                      <a:ext uri="{53640926-AAD7-44D8-BBD7-CCE9431645EC}">
+                        <a14:shadowObscured xmlns:a14="http://schemas.microsoft.com/office/drawing/2010/main"/>
+                      </a:ext>
+                    </a:extLst>
+                  </pic:spPr>
+                </pic:pic>
+              </a:graphicData>
+            </a:graphic>
+          </wp:inline>
+        </w:drawing>
+      </w:r>
     </w:p>
     <w:p>
       <w:pPr>
@@ -2059,6 +2184,7 @@
         <w:rPr>
           <w:rFonts w:ascii="Times New Roman" w:hAnsi="Times New Roman"/>
           <w:i/>
+          <w:noProof/>
           <w:sz w:val="18"/>
           <w:szCs w:val="18"/>
         </w:rPr>
@@ -2080,7 +2206,7 @@
                     </pic:cNvPicPr>
                   </pic:nvPicPr>
                   <pic:blipFill>
-                    <a:blip r:embed="rId9" cstate="print">
+                    <a:blip r:embed="rId11" cstate="print">
                       <a:extLst>
                         <a:ext uri="{28A0092B-C50C-407E-A947-70E740481C1C}">
                           <a14:useLocalDpi xmlns:a14="http://schemas.microsoft.com/office/drawing/2010/main" val="0"/>
@@ -2332,6 +2458,11 @@
     <w:p>
       <w:pPr>
         <w:spacing w:after="80"/>
+        <w:rPr>
+          <w:rFonts w:ascii="Times New Roman" w:hAnsi="Times New Roman"/>
+          <w:sz w:val="22"/>
+          <w:szCs w:val="22"/>
+        </w:rPr>
       </w:pPr>
       <w:r>
         <w:rPr>
@@ -2346,6 +2477,11 @@
       <w:pPr>
         <w:spacing w:after="80"/>
       </w:pPr>
+    </w:p>
+    <w:p>
+      <w:pPr>
+        <w:spacing w:after="80"/>
+      </w:pPr>
       <w:r>
         <w:rPr>
           <w:rFonts w:ascii="Times New Roman" w:hAnsi="Times New Roman"/>
@@ -2400,6 +2536,11 @@
     <w:p>
       <w:pPr>
         <w:spacing w:after="80"/>
+        <w:rPr>
+          <w:rFonts w:ascii="Times New Roman" w:hAnsi="Times New Roman"/>
+          <w:sz w:val="22"/>
+          <w:szCs w:val="22"/>
+        </w:rPr>
       </w:pPr>
       <w:r>
         <w:rPr>
@@ -2466,6 +2607,7 @@
           <w:sz w:val="22"/>
           <w:szCs w:val="22"/>
         </w:rPr>
+        <w:lastRenderedPageBreak/>
         <w:t>________________________________________________</w:t>
       </w:r>
     </w:p>
@@ -2493,7 +2635,6 @@
           <w:sz w:val="22"/>
           <w:szCs w:val="22"/>
         </w:rPr>
-        <w:lastRenderedPageBreak/>
         <w:t>(ii) If a carcinogen must be used, state TWO safety precautions that should be taken.</w:t>
       </w:r>
     </w:p>
@@ -2565,6 +2706,89 @@
         </w:rPr>
         <w:t>10. Amy heated a solid sample that gives off water vapour during heating. She held the test tube horizontally with the solid forming a shallow layer along the tube.</w:t>
       </w:r>
+      <w:r>
+        <w:rPr>
+          <w:rFonts w:ascii="Times New Roman" w:hAnsi="Times New Roman"/>
+          <w:sz w:val="22"/>
+          <w:szCs w:val="22"/>
+        </w:rPr>
+        <w:t xml:space="preserve"> </w:t>
+      </w:r>
+    </w:p>
+    <w:p>
+      <w:pPr>
+        <w:spacing w:after="80"/>
+        <w:rPr>
+          <w:rFonts w:ascii="Times New Roman" w:hAnsi="Times New Roman"/>
+          <w:sz w:val="22"/>
+          <w:szCs w:val="22"/>
+        </w:rPr>
+      </w:pPr>
+      <w:r>
+        <w:rPr>
+          <w:rFonts w:ascii="Times New Roman" w:hAnsi="Times New Roman"/>
+          <w:sz w:val="22"/>
+          <w:szCs w:val="22"/>
+        </w:rPr>
+        <w:drawing>
+          <wp:inline distT="0" distB="0" distL="0" distR="0" wp14:anchorId="268CBC4A" wp14:editId="35B6BFD5">
+            <wp:extent cx="3473450" cy="2605263"/>
+            <wp:effectExtent l="0" t="0" r="0" b="5080"/>
+            <wp:docPr id="635069062" name="Picture 5"/>
+            <wp:cNvGraphicFramePr>
+              <a:graphicFrameLocks xmlns:a="http://schemas.openxmlformats.org/drawingml/2006/main" noChangeAspect="1"/>
+            </wp:cNvGraphicFramePr>
+            <a:graphic xmlns:a="http://schemas.openxmlformats.org/drawingml/2006/main">
+              <a:graphicData uri="http://schemas.openxmlformats.org/drawingml/2006/picture">
+                <pic:pic xmlns:pic="http://schemas.openxmlformats.org/drawingml/2006/picture">
+                  <pic:nvPicPr>
+                    <pic:cNvPr id="0" name="Picture 15"/>
+                    <pic:cNvPicPr>
+                      <a:picLocks noChangeAspect="1" noChangeArrowheads="1"/>
+                    </pic:cNvPicPr>
+                  </pic:nvPicPr>
+                  <pic:blipFill>
+                    <a:blip r:embed="rId12" cstate="print">
+                      <a:extLst>
+                        <a:ext uri="{28A0092B-C50C-407E-A947-70E740481C1C}">
+                          <a14:useLocalDpi xmlns:a14="http://schemas.microsoft.com/office/drawing/2010/main" val="0"/>
+                        </a:ext>
+                      </a:extLst>
+                    </a:blip>
+                    <a:srcRect/>
+                    <a:stretch>
+                      <a:fillRect/>
+                    </a:stretch>
+                  </pic:blipFill>
+                  <pic:spPr bwMode="auto">
+                    <a:xfrm>
+                      <a:off x="0" y="0"/>
+                      <a:ext cx="3489979" cy="2617660"/>
+                    </a:xfrm>
+                    <a:prstGeom prst="rect">
+                      <a:avLst/>
+                    </a:prstGeom>
+                    <a:noFill/>
+                    <a:ln>
+                      <a:noFill/>
+                    </a:ln>
+                  </pic:spPr>
+                </pic:pic>
+              </a:graphicData>
+            </a:graphic>
+          </wp:inline>
+        </w:drawing>
+      </w:r>
+    </w:p>
+    <w:p>
+      <w:pPr>
+        <w:spacing w:after="80"/>
+        <w:rPr>
+          <w:rFonts w:ascii="Times New Roman" w:hAnsi="Times New Roman"/>
+          <w:sz w:val="22"/>
+          <w:szCs w:val="22"/>
+        </w:rPr>
+      </w:pPr>
     </w:p>
     <w:p>
       <w:pPr>
@@ -2720,21 +2944,50 @@
       </w:r>
     </w:p>
     <w:p>
-      <w:pPr>
-        <w:spacing w:after="80"/>
-      </w:pPr>
-    </w:p>
-    <w:p>
-      <w:pPr>
-        <w:spacing w:after="80"/>
-      </w:pPr>
-      <w:r>
-        <w:rPr>
-          <w:rFonts w:ascii="Times New Roman" w:hAnsi="Times New Roman"/>
-          <w:sz w:val="22"/>
-          <w:szCs w:val="22"/>
-        </w:rPr>
-        <w:t>11. Peter strongly heated a solid sample as shown below.</w:t>
+      <w:r>
+        <w:br w:type="page"/>
+      </w:r>
+    </w:p>
+    <w:p>
+      <w:pPr>
+        <w:spacing w:after="80"/>
+      </w:pPr>
+    </w:p>
+    <w:p>
+      <w:pPr>
+        <w:spacing w:after="80"/>
+      </w:pPr>
+      <w:r>
+        <w:rPr>
+          <w:rFonts w:ascii="Times New Roman" w:hAnsi="Times New Roman"/>
+          <w:sz w:val="22"/>
+          <w:szCs w:val="22"/>
+        </w:rPr>
+        <w:t>11</w:t>
+      </w:r>
+      <w:r>
+        <w:rPr>
+          <w:rFonts w:ascii="Times New Roman" w:hAnsi="Times New Roman"/>
+          <w:sz w:val="22"/>
+          <w:szCs w:val="22"/>
+        </w:rPr>
+        <w:t>**</w:t>
+      </w:r>
+      <w:r>
+        <w:rPr>
+          <w:rFonts w:ascii="Times New Roman" w:hAnsi="Times New Roman"/>
+          <w:sz w:val="22"/>
+          <w:szCs w:val="22"/>
+        </w:rPr>
+        <w:t>. Peter strongly heated a solid sample as shown below.</w:t>
+      </w:r>
+      <w:r>
+        <w:rPr>
+          <w:rFonts w:ascii="Times New Roman" w:hAnsi="Times New Roman"/>
+          <w:sz w:val="22"/>
+          <w:szCs w:val="22"/>
+        </w:rPr>
+        <w:t xml:space="preserve"> (DIFFICULT)</w:t>
       </w:r>
     </w:p>
     <w:p>
@@ -2751,6 +3004,7 @@
         <w:rPr>
           <w:rFonts w:ascii="Times New Roman" w:hAnsi="Times New Roman"/>
           <w:i/>
+          <w:noProof/>
           <w:sz w:val="18"/>
           <w:szCs w:val="18"/>
         </w:rPr>
@@ -2772,7 +3026,7 @@
                     </pic:cNvPicPr>
                   </pic:nvPicPr>
                   <pic:blipFill>
-                    <a:blip r:embed="rId10" cstate="print">
+                    <a:blip r:embed="rId13" cstate="print">
                       <a:extLst>
                         <a:ext uri="{28A0092B-C50C-407E-A947-70E740481C1C}">
                           <a14:useLocalDpi xmlns:a14="http://schemas.microsoft.com/office/drawing/2010/main" val="0"/>
@@ -2907,11 +3161,6 @@
         </w:rPr>
         <w:br w:type="page"/>
       </w:r>
-    </w:p>
-    <w:p>
-      <w:pPr>
-        <w:spacing w:after="80"/>
-      </w:pPr>
       <w:r>
         <w:rPr>
           <w:rFonts w:ascii="Times New Roman" w:hAnsi="Times New Roman"/>
@@ -2919,7 +3168,23 @@
           <w:szCs w:val="22"/>
         </w:rPr>
         <w:lastRenderedPageBreak/>
-        <w:t xml:space="preserve">12. Study the following diagrams. For each of them, write down </w:t>
+        <w:t>12</w:t>
+      </w:r>
+      <w:r>
+        <w:rPr>
+          <w:rFonts w:ascii="Times New Roman" w:hAnsi="Times New Roman"/>
+          <w:sz w:val="22"/>
+          <w:szCs w:val="22"/>
+        </w:rPr>
+        <w:t>**</w:t>
+      </w:r>
+      <w:r>
+        <w:rPr>
+          <w:rFonts w:ascii="Times New Roman" w:hAnsi="Times New Roman"/>
+          <w:sz w:val="22"/>
+          <w:szCs w:val="22"/>
+        </w:rPr>
+        <w:t xml:space="preserve">. Study the following diagrams. For each of them, write down </w:t>
       </w:r>
       <w:r>
         <w:rPr>
@@ -2944,6 +3209,14 @@
           <w:szCs w:val="22"/>
         </w:rPr>
         <w:t xml:space="preserve"> and state the correct method.</w:t>
+      </w:r>
+      <w:r>
+        <w:rPr>
+          <w:rFonts w:ascii="Times New Roman" w:hAnsi="Times New Roman"/>
+          <w:sz w:val="22"/>
+          <w:szCs w:val="22"/>
+        </w:rPr>
+        <w:t xml:space="preserve"> (DIFFICULT)</w:t>
       </w:r>
     </w:p>
     <w:p>
@@ -2974,6 +3247,7 @@
         <w:rPr>
           <w:rFonts w:ascii="Times New Roman" w:hAnsi="Times New Roman"/>
           <w:i/>
+          <w:noProof/>
           <w:sz w:val="18"/>
           <w:szCs w:val="18"/>
         </w:rPr>
@@ -2995,7 +3269,7 @@
                     </pic:cNvPicPr>
                   </pic:nvPicPr>
                   <pic:blipFill>
-                    <a:blip r:embed="rId11" cstate="print">
+                    <a:blip r:embed="rId14" cstate="print">
                       <a:extLst>
                         <a:ext uri="{28A0092B-C50C-407E-A947-70E740481C1C}">
                           <a14:useLocalDpi xmlns:a14="http://schemas.microsoft.com/office/drawing/2010/main" val="0"/>
@@ -3095,6 +3369,7 @@
         <w:rPr>
           <w:rFonts w:ascii="Times New Roman" w:hAnsi="Times New Roman"/>
           <w:i/>
+          <w:noProof/>
           <w:sz w:val="18"/>
           <w:szCs w:val="18"/>
         </w:rPr>
@@ -3116,7 +3391,7 @@
                     </pic:cNvPicPr>
                   </pic:nvPicPr>
                   <pic:blipFill>
-                    <a:blip r:embed="rId12" cstate="print">
+                    <a:blip r:embed="rId15" cstate="print">
                       <a:extLst>
                         <a:ext uri="{28A0092B-C50C-407E-A947-70E740481C1C}">
                           <a14:useLocalDpi xmlns:a14="http://schemas.microsoft.com/office/drawing/2010/main" val="0"/>
@@ -3204,6 +3479,7 @@
         <w:rPr>
           <w:rFonts w:ascii="Times New Roman" w:hAnsi="Times New Roman"/>
           <w:i/>
+          <w:noProof/>
           <w:sz w:val="18"/>
           <w:szCs w:val="18"/>
         </w:rPr>
@@ -3226,7 +3502,7 @@
                     </pic:cNvPicPr>
                   </pic:nvPicPr>
                   <pic:blipFill rotWithShape="1">
-                    <a:blip r:embed="rId13" cstate="print">
+                    <a:blip r:embed="rId16" cstate="print">
                       <a:extLst>
                         <a:ext uri="{28A0092B-C50C-407E-A947-70E740481C1C}">
                           <a14:useLocalDpi xmlns:a14="http://schemas.microsoft.com/office/drawing/2010/main" val="0"/>
@@ -3333,7 +3609,23 @@
           <w:sz w:val="22"/>
           <w:szCs w:val="22"/>
         </w:rPr>
-        <w:t xml:space="preserve">13. Study the following diagrams. For each of them, write down </w:t>
+        <w:t>13</w:t>
+      </w:r>
+      <w:r>
+        <w:rPr>
+          <w:rFonts w:ascii="Times New Roman" w:hAnsi="Times New Roman"/>
+          <w:sz w:val="22"/>
+          <w:szCs w:val="22"/>
+        </w:rPr>
+        <w:t>**</w:t>
+      </w:r>
+      <w:r>
+        <w:rPr>
+          <w:rFonts w:ascii="Times New Roman" w:hAnsi="Times New Roman"/>
+          <w:sz w:val="22"/>
+          <w:szCs w:val="22"/>
+        </w:rPr>
+        <w:t xml:space="preserve">. Study the following diagrams. For each of them, write down </w:t>
       </w:r>
       <w:r>
         <w:rPr>
@@ -3358,6 +3650,14 @@
           <w:szCs w:val="22"/>
         </w:rPr>
         <w:t>. Explain why.</w:t>
+      </w:r>
+      <w:r>
+        <w:rPr>
+          <w:rFonts w:ascii="Times New Roman" w:hAnsi="Times New Roman"/>
+          <w:sz w:val="22"/>
+          <w:szCs w:val="22"/>
+        </w:rPr>
+        <w:t xml:space="preserve"> (DIFFICULT)</w:t>
       </w:r>
     </w:p>
     <w:p>
@@ -3388,6 +3688,7 @@
         <w:rPr>
           <w:rFonts w:ascii="Times New Roman" w:hAnsi="Times New Roman"/>
           <w:i/>
+          <w:noProof/>
           <w:sz w:val="18"/>
           <w:szCs w:val="18"/>
         </w:rPr>
@@ -3409,7 +3710,7 @@
                     </pic:cNvPicPr>
                   </pic:nvPicPr>
                   <pic:blipFill>
-                    <a:blip r:embed="rId14" cstate="print">
+                    <a:blip r:embed="rId17" cstate="print">
                       <a:extLst>
                         <a:ext uri="{28A0092B-C50C-407E-A947-70E740481C1C}">
                           <a14:useLocalDpi xmlns:a14="http://schemas.microsoft.com/office/drawing/2010/main" val="0"/>
@@ -3497,6 +3798,7 @@
         <w:rPr>
           <w:rFonts w:ascii="Times New Roman" w:hAnsi="Times New Roman"/>
           <w:i/>
+          <w:noProof/>
           <w:sz w:val="18"/>
           <w:szCs w:val="18"/>
         </w:rPr>
@@ -3518,7 +3820,7 @@
                     </pic:cNvPicPr>
                   </pic:nvPicPr>
                   <pic:blipFill>
-                    <a:blip r:embed="rId15" cstate="print">
+                    <a:blip r:embed="rId18" cstate="print">
                       <a:extLst>
                         <a:ext uri="{28A0092B-C50C-407E-A947-70E740481C1C}">
                           <a14:useLocalDpi xmlns:a14="http://schemas.microsoft.com/office/drawing/2010/main" val="0"/>
@@ -3620,6 +3922,7 @@
         <w:rPr>
           <w:rFonts w:ascii="Times New Roman" w:hAnsi="Times New Roman"/>
           <w:i/>
+          <w:noProof/>
           <w:sz w:val="18"/>
           <w:szCs w:val="18"/>
         </w:rPr>
@@ -3641,7 +3944,7 @@
                     </pic:cNvPicPr>
                   </pic:nvPicPr>
                   <pic:blipFill>
-                    <a:blip r:embed="rId16" cstate="print">
+                    <a:blip r:embed="rId19" cstate="print">
                       <a:extLst>
                         <a:ext uri="{28A0092B-C50C-407E-A947-70E740481C1C}">
                           <a14:useLocalDpi xmlns:a14="http://schemas.microsoft.com/office/drawing/2010/main" val="0"/>
@@ -4733,7 +5036,23 @@
           <w:sz w:val="22"/>
           <w:szCs w:val="22"/>
         </w:rPr>
-        <w:t xml:space="preserve">Chemical B - wear laboratory coat, safety spectacles and gloves / avoid contact with eyes and skin / perform experiment in fume cupboard / keep container properly </w:t>
+        <w:t xml:space="preserve">Chemical B - wear laboratory coat, safety </w:t>
+      </w:r>
+      <w:r>
+        <w:rPr>
+          <w:rFonts w:ascii="Times New Roman" w:hAnsi="Times New Roman"/>
+          <w:sz w:val="22"/>
+          <w:szCs w:val="22"/>
+        </w:rPr>
+        <w:t>goggles</w:t>
+      </w:r>
+      <w:r>
+        <w:rPr>
+          <w:rFonts w:ascii="Times New Roman" w:hAnsi="Times New Roman"/>
+          <w:sz w:val="22"/>
+          <w:szCs w:val="22"/>
+        </w:rPr>
+        <w:t xml:space="preserve"> and gloves / perform experiment in fume cupboard / keep container properly </w:t>
       </w:r>
       <w:proofErr w:type="gramStart"/>
       <w:r>
@@ -5030,16 +5349,14 @@
         </w:rPr>
         <w:t xml:space="preserve">(c) Test tube </w:t>
       </w:r>
-      <w:proofErr w:type="gramStart"/>
-      <w:r>
-        <w:rPr>
-          <w:rFonts w:ascii="Times New Roman" w:hAnsi="Times New Roman"/>
-          <w:sz w:val="22"/>
-          <w:szCs w:val="22"/>
-        </w:rPr>
-        <w:t>holder  1</w:t>
-      </w:r>
-      <w:proofErr w:type="gramEnd"/>
+      <w:r>
+        <w:rPr>
+          <w:rFonts w:ascii="Times New Roman" w:hAnsi="Times New Roman"/>
+          <w:sz w:val="22"/>
+          <w:szCs w:val="22"/>
+        </w:rPr>
+        <w:t>holder 1</w:t>
+      </w:r>
     </w:p>
     <w:p>
       <w:pPr>
@@ -5146,7 +5463,86 @@
           <w:sz w:val="22"/>
           <w:szCs w:val="22"/>
         </w:rPr>
-        <w:t>Pour unused chemicals into another bottle instead</w:t>
+        <w:t>Pour unused chemicals into another bottle instead.  1</w:t>
+      </w:r>
+    </w:p>
+    <w:p>
+      <w:pPr>
+        <w:spacing w:after="80"/>
+      </w:pPr>
+      <w:r>
+        <w:rPr>
+          <w:rFonts w:ascii="Times New Roman" w:hAnsi="Times New Roman"/>
+          <w:sz w:val="22"/>
+          <w:szCs w:val="22"/>
+        </w:rPr>
+        <w:t xml:space="preserve">(b) Placing chemicals directly on the balance pan.  </w:t>
+      </w:r>
+      <w:r>
+        <w:rPr>
+          <w:rFonts w:ascii="Times New Roman" w:hAnsi="Times New Roman"/>
+          <w:sz w:val="22"/>
+          <w:szCs w:val="22"/>
+        </w:rPr>
+        <w:t xml:space="preserve">May corrode or contaminate the </w:t>
+      </w:r>
+      <w:r>
+        <w:rPr>
+          <w:rFonts w:ascii="Times New Roman" w:hAnsi="Times New Roman"/>
+          <w:sz w:val="22"/>
+          <w:szCs w:val="22"/>
+        </w:rPr>
+        <w:t>pan.</w:t>
+      </w:r>
+      <w:r>
+        <w:rPr>
+          <w:rFonts w:ascii="Times New Roman" w:hAnsi="Times New Roman"/>
+          <w:sz w:val="22"/>
+          <w:szCs w:val="22"/>
+        </w:rPr>
+        <w:t xml:space="preserve"> </w:t>
+      </w:r>
+      <w:r>
+        <w:rPr>
+          <w:rFonts w:ascii="Times New Roman" w:hAnsi="Times New Roman"/>
+          <w:sz w:val="22"/>
+          <w:szCs w:val="22"/>
+        </w:rPr>
+        <w:t>1</w:t>
+      </w:r>
+    </w:p>
+    <w:p>
+      <w:pPr>
+        <w:spacing w:after="80"/>
+      </w:pPr>
+      <w:r>
+        <w:rPr>
+          <w:rFonts w:ascii="Times New Roman" w:hAnsi="Times New Roman"/>
+          <w:sz w:val="22"/>
+          <w:szCs w:val="22"/>
+        </w:rPr>
+        <w:t>Should use filter paper or a weighing bottle.  1</w:t>
+      </w:r>
+    </w:p>
+    <w:p>
+      <w:pPr>
+        <w:spacing w:after="80"/>
+      </w:pPr>
+      <w:r>
+        <w:rPr>
+          <w:rFonts w:ascii="Times New Roman" w:hAnsi="Times New Roman"/>
+          <w:sz w:val="22"/>
+          <w:szCs w:val="22"/>
+        </w:rPr>
+        <w:t>(c) Delivery tube not removed from water before heating stopped</w:t>
+      </w:r>
+      <w:r>
+        <w:rPr>
+          <w:rFonts w:ascii="Times New Roman" w:hAnsi="Times New Roman"/>
+          <w:sz w:val="22"/>
+          <w:szCs w:val="22"/>
+        </w:rPr>
+        <w:t>, risk of sucking back of water into the hot vessel</w:t>
       </w:r>
       <w:r>
         <w:rPr>
@@ -5167,120 +5563,7 @@
           <w:sz w:val="22"/>
           <w:szCs w:val="22"/>
         </w:rPr>
-        <w:t xml:space="preserve">(b) Placing chemicals directly on the balance pan.  </w:t>
-      </w:r>
-      <w:r>
-        <w:rPr>
-          <w:rFonts w:ascii="Times New Roman" w:hAnsi="Times New Roman"/>
-          <w:sz w:val="22"/>
-          <w:szCs w:val="22"/>
-        </w:rPr>
-        <w:t xml:space="preserve">May corrode or contaminate the </w:t>
-      </w:r>
-      <w:proofErr w:type="gramStart"/>
-      <w:r>
-        <w:rPr>
-          <w:rFonts w:ascii="Times New Roman" w:hAnsi="Times New Roman"/>
-          <w:sz w:val="22"/>
-          <w:szCs w:val="22"/>
-        </w:rPr>
-        <w:t xml:space="preserve">pan </w:t>
-      </w:r>
-      <w:r>
-        <w:rPr>
-          <w:rFonts w:ascii="Times New Roman" w:hAnsi="Times New Roman"/>
-          <w:sz w:val="22"/>
-          <w:szCs w:val="22"/>
-        </w:rPr>
-        <w:t>.</w:t>
-      </w:r>
-      <w:proofErr w:type="gramEnd"/>
-      <w:r>
-        <w:rPr>
-          <w:rFonts w:ascii="Times New Roman" w:hAnsi="Times New Roman"/>
-          <w:sz w:val="22"/>
-          <w:szCs w:val="22"/>
-        </w:rPr>
-        <w:t xml:space="preserve"> </w:t>
-      </w:r>
-      <w:r>
-        <w:rPr>
-          <w:rFonts w:ascii="Times New Roman" w:hAnsi="Times New Roman"/>
-          <w:sz w:val="22"/>
-          <w:szCs w:val="22"/>
-        </w:rPr>
-        <w:t>1</w:t>
-      </w:r>
-    </w:p>
-    <w:p>
-      <w:pPr>
-        <w:spacing w:after="80"/>
-      </w:pPr>
-      <w:r>
-        <w:rPr>
-          <w:rFonts w:ascii="Times New Roman" w:hAnsi="Times New Roman"/>
-          <w:sz w:val="22"/>
-          <w:szCs w:val="22"/>
-        </w:rPr>
-        <w:t>S</w:t>
-      </w:r>
-      <w:r>
-        <w:rPr>
-          <w:rFonts w:ascii="Times New Roman" w:hAnsi="Times New Roman"/>
-          <w:sz w:val="22"/>
-          <w:szCs w:val="22"/>
-        </w:rPr>
-        <w:t>hould use filter paper or a weighing bottle.  1</w:t>
-      </w:r>
-    </w:p>
-    <w:p>
-      <w:pPr>
-        <w:spacing w:after="80"/>
-      </w:pPr>
-      <w:r>
-        <w:rPr>
-          <w:rFonts w:ascii="Times New Roman" w:hAnsi="Times New Roman"/>
-          <w:sz w:val="22"/>
-          <w:szCs w:val="22"/>
-        </w:rPr>
-        <w:t>(c) Delivery tube not removed from water before heating stopped</w:t>
-      </w:r>
-      <w:r>
-        <w:rPr>
-          <w:rFonts w:ascii="Times New Roman" w:hAnsi="Times New Roman"/>
-          <w:sz w:val="22"/>
-          <w:szCs w:val="22"/>
-        </w:rPr>
-        <w:t>, risk of sucking back of water into the hot vessel</w:t>
-      </w:r>
-      <w:r>
-        <w:rPr>
-          <w:rFonts w:ascii="Times New Roman" w:hAnsi="Times New Roman"/>
-          <w:sz w:val="22"/>
-          <w:szCs w:val="22"/>
-        </w:rPr>
-        <w:t>.  1</w:t>
-      </w:r>
-    </w:p>
-    <w:p>
-      <w:pPr>
-        <w:spacing w:after="80"/>
-      </w:pPr>
-      <w:r>
-        <w:rPr>
-          <w:rFonts w:ascii="Times New Roman" w:hAnsi="Times New Roman"/>
-          <w:sz w:val="22"/>
-          <w:szCs w:val="22"/>
-        </w:rPr>
-        <w:t>Remove delivery tube from water before turning off the heat</w:t>
-      </w:r>
-      <w:r>
-        <w:rPr>
-          <w:rFonts w:ascii="Times New Roman" w:hAnsi="Times New Roman"/>
-          <w:sz w:val="22"/>
-          <w:szCs w:val="22"/>
-        </w:rPr>
-        <w:t>.  1</w:t>
+        <w:t>Remove delivery tube from water before turning off the heat.  1</w:t>
       </w:r>
     </w:p>
     <w:p>

</xml_diff>